<commit_message>
Name: "1.0" for the present program instead of "1.x" (D27)
The user: one name, 1.0. Docs, code comments, screen text, the two
docx files and the name lists' source notes say 1.0 now. File and
tool names (v1-golden, lib/io/v1.cjs, ...) and past commit messages
stay. npm test 191/191.

Co-Authored-By: Claude Opus 5.5 <noreply@anthropic.com>
Claude-Session: https://claude.ai/code/session_014oUvvbV1TxNthW87SnkXuX
</commit_message>
<xml_diff>
--- a/docs/v2/HVAC_Grid_Ver2.0_계획서.docx
+++ b/docs/v2/HVAC_Grid_Ver2.0_계획서.docx
@@ -302,7 +302,7 @@
           <w:sz w:val="20"/>
           <w:szCs w:val="20"/>
         </w:rPr>
-        <w:t xml:space="preserve">1.x </w:t>
+        <w:t xml:space="preserve">1.0 </w:t>
       </w:r>
       <w:r>
         <w:rPr>
@@ -1799,7 +1799,7 @@
           <w:b/>
           <w:bCs/>
         </w:rPr>
-        <w:t>1.x</w:t>
+        <w:t>1.0</w:t>
       </w:r>
       <w:r>
         <w:rPr>
@@ -2325,7 +2325,7 @@
         <w:t>결과가</w:t>
       </w:r>
       <w:r>
-        <w:t xml:space="preserve"> 1.x </w:t>
+        <w:t xml:space="preserve"> 1.0 </w:t>
       </w:r>
       <w:r>
         <w:t>결과</w:t>
@@ -2728,7 +2728,7 @@
                 <w:sz w:val="17"/>
                 <w:szCs w:val="17"/>
               </w:rPr>
-              <w:t xml:space="preserve"> 1.x </w:t>
+              <w:t xml:space="preserve"> 1.0 </w:t>
             </w:r>
             <w:r>
               <w:rPr>
@@ -2805,7 +2805,7 @@
                 <w:sz w:val="17"/>
                 <w:szCs w:val="17"/>
               </w:rPr>
-              <w:t xml:space="preserve">1.x </w:t>
+              <w:t xml:space="preserve">1.0 </w:t>
             </w:r>
             <w:r>
               <w:rPr>
@@ -9018,7 +9018,7 @@
         <w:t>목표</w:t>
       </w:r>
       <w:r>
-        <w:t>: 1.x</w:t>
+        <w:t>: 1.0</w:t>
       </w:r>
       <w:r>
         <w:t>가</w:t>
@@ -9271,7 +9271,7 @@
                 <w:sz w:val="17"/>
                 <w:szCs w:val="17"/>
               </w:rPr>
-              <w:t xml:space="preserve">1.x </w:t>
+              <w:t xml:space="preserve">1.0 </w:t>
             </w:r>
             <w:r>
               <w:rPr>
@@ -11123,7 +11123,7 @@
         <w:t>기준값을</w:t>
       </w:r>
       <w:r>
-        <w:t xml:space="preserve"> 1.x</w:t>
+        <w:t xml:space="preserve"> 1.0</w:t>
       </w:r>
       <w:r>
         <w:t>로</w:t>
@@ -11280,7 +11280,7 @@
         <w:t>뒤의</w:t>
       </w:r>
       <w:r>
-        <w:t xml:space="preserve"> 1.x</w:t>
+        <w:t xml:space="preserve"> 1.0</w:t>
       </w:r>
       <w:r>
         <w:t>로</w:t>
@@ -12265,7 +12265,7 @@
                 <w:sz w:val="17"/>
                 <w:szCs w:val="17"/>
               </w:rPr>
-              <w:t xml:space="preserve"> BOX y(1.x </w:t>
+              <w:t xml:space="preserve"> BOX y(1.0 </w:t>
             </w:r>
             <w:r>
               <w:rPr>
@@ -14976,7 +14976,7 @@
                 <w:sz w:val="17"/>
                 <w:szCs w:val="17"/>
               </w:rPr>
-              <w:t xml:space="preserve"> 1.x </w:t>
+              <w:t xml:space="preserve"> 1.0 </w:t>
             </w:r>
             <w:r>
               <w:rPr>
@@ -16396,7 +16396,7 @@
                 <w:sz w:val="17"/>
                 <w:szCs w:val="17"/>
               </w:rPr>
-              <w:t xml:space="preserve">1.x </w:t>
+              <w:t xml:space="preserve">1.0 </w:t>
             </w:r>
             <w:r>
               <w:rPr>
@@ -17238,7 +17238,7 @@
                 <w:sz w:val="17"/>
                 <w:szCs w:val="17"/>
               </w:rPr>
-              <w:t xml:space="preserve">: 1.x </w:t>
+              <w:t xml:space="preserve">: 1.0 </w:t>
             </w:r>
             <w:r>
               <w:rPr>
@@ -17778,7 +17778,7 @@
         <w:t>유지됨</w:t>
       </w:r>
       <w:r>
-        <w:t xml:space="preserve">. 1.x </w:t>
+        <w:t xml:space="preserve">. 1.0 </w:t>
       </w:r>
       <w:r>
         <w:t>프로젝트를</w:t>
@@ -21213,7 +21213,7 @@
                 <w:sz w:val="17"/>
                 <w:szCs w:val="17"/>
               </w:rPr>
-              <w:t xml:space="preserve">. 1.x </w:t>
+              <w:t xml:space="preserve">. 1.0 </w:t>
             </w:r>
             <w:r>
               <w:rPr>
@@ -22480,7 +22480,7 @@
                 <w:sz w:val="17"/>
                 <w:szCs w:val="17"/>
               </w:rPr>
-              <w:t xml:space="preserve">, 1.x </w:t>
+              <w:t xml:space="preserve">, 1.0 </w:t>
             </w:r>
             <w:r>
               <w:rPr>
@@ -23454,7 +23454,7 @@
                 <w:sz w:val="17"/>
                 <w:szCs w:val="17"/>
               </w:rPr>
-              <w:t xml:space="preserve"> 1.x</w:t>
+              <w:t xml:space="preserve"> 1.0</w:t>
             </w:r>
             <w:r>
               <w:rPr>
@@ -23595,7 +23595,7 @@
                 <w:sz w:val="17"/>
                 <w:szCs w:val="17"/>
               </w:rPr>
-              <w:t xml:space="preserve">, 1.x </w:t>
+              <w:t xml:space="preserve">, 1.0 </w:t>
             </w:r>
             <w:r>
               <w:rPr>
@@ -24450,7 +24450,7 @@
                 <w:sz w:val="17"/>
                 <w:szCs w:val="17"/>
               </w:rPr>
-              <w:t>(1.x</w:t>
+              <w:t>(1.0</w:t>
             </w:r>
             <w:r>
               <w:rPr>
@@ -27235,7 +27235,7 @@
                 <w:sz w:val="17"/>
                 <w:szCs w:val="17"/>
               </w:rPr>
-              <w:t xml:space="preserve"> 1.x</w:t>
+              <w:t xml:space="preserve"> 1.0</w:t>
             </w:r>
             <w:r>
               <w:rPr>
@@ -28288,7 +28288,7 @@
                 <w:sz w:val="17"/>
                 <w:szCs w:val="17"/>
               </w:rPr>
-              <w:t>1.x</w:t>
+              <w:t>1.0</w:t>
             </w:r>
             <w:r>
               <w:rPr>

</xml_diff>

<commit_message>
Name: "1.0" for the present program instead of "1.x"
The user: one name, 1.0. The Ver 2.0 plan documents on main (md and
docx) say 1.0 now; nothing else on main used "1.x".

Co-Authored-By: Claude Opus 5.5 <noreply@anthropic.com>
Claude-Session: https://claude.ai/code/session_014oUvvbV1TxNthW87SnkXuX
</commit_message>
<xml_diff>
--- a/docs/v2/HVAC_Grid_Ver2.0_계획서.docx
+++ b/docs/v2/HVAC_Grid_Ver2.0_계획서.docx
@@ -302,7 +302,7 @@
           <w:sz w:val="20"/>
           <w:szCs w:val="20"/>
         </w:rPr>
-        <w:t xml:space="preserve">1.x </w:t>
+        <w:t xml:space="preserve">1.0 </w:t>
       </w:r>
       <w:r>
         <w:rPr>
@@ -1799,7 +1799,7 @@
           <w:b/>
           <w:bCs/>
         </w:rPr>
-        <w:t>1.x</w:t>
+        <w:t>1.0</w:t>
       </w:r>
       <w:r>
         <w:rPr>
@@ -2325,7 +2325,7 @@
         <w:t>결과가</w:t>
       </w:r>
       <w:r>
-        <w:t xml:space="preserve"> 1.x </w:t>
+        <w:t xml:space="preserve"> 1.0 </w:t>
       </w:r>
       <w:r>
         <w:t>결과</w:t>
@@ -2728,7 +2728,7 @@
                 <w:sz w:val="17"/>
                 <w:szCs w:val="17"/>
               </w:rPr>
-              <w:t xml:space="preserve"> 1.x </w:t>
+              <w:t xml:space="preserve"> 1.0 </w:t>
             </w:r>
             <w:r>
               <w:rPr>
@@ -2805,7 +2805,7 @@
                 <w:sz w:val="17"/>
                 <w:szCs w:val="17"/>
               </w:rPr>
-              <w:t xml:space="preserve">1.x </w:t>
+              <w:t xml:space="preserve">1.0 </w:t>
             </w:r>
             <w:r>
               <w:rPr>
@@ -9018,7 +9018,7 @@
         <w:t>목표</w:t>
       </w:r>
       <w:r>
-        <w:t>: 1.x</w:t>
+        <w:t>: 1.0</w:t>
       </w:r>
       <w:r>
         <w:t>가</w:t>
@@ -9271,7 +9271,7 @@
                 <w:sz w:val="17"/>
                 <w:szCs w:val="17"/>
               </w:rPr>
-              <w:t xml:space="preserve">1.x </w:t>
+              <w:t xml:space="preserve">1.0 </w:t>
             </w:r>
             <w:r>
               <w:rPr>
@@ -11123,7 +11123,7 @@
         <w:t>기준값을</w:t>
       </w:r>
       <w:r>
-        <w:t xml:space="preserve"> 1.x</w:t>
+        <w:t xml:space="preserve"> 1.0</w:t>
       </w:r>
       <w:r>
         <w:t>로</w:t>
@@ -11280,7 +11280,7 @@
         <w:t>뒤의</w:t>
       </w:r>
       <w:r>
-        <w:t xml:space="preserve"> 1.x</w:t>
+        <w:t xml:space="preserve"> 1.0</w:t>
       </w:r>
       <w:r>
         <w:t>로</w:t>
@@ -12265,7 +12265,7 @@
                 <w:sz w:val="17"/>
                 <w:szCs w:val="17"/>
               </w:rPr>
-              <w:t xml:space="preserve"> BOX y(1.x </w:t>
+              <w:t xml:space="preserve"> BOX y(1.0 </w:t>
             </w:r>
             <w:r>
               <w:rPr>
@@ -14976,7 +14976,7 @@
                 <w:sz w:val="17"/>
                 <w:szCs w:val="17"/>
               </w:rPr>
-              <w:t xml:space="preserve"> 1.x </w:t>
+              <w:t xml:space="preserve"> 1.0 </w:t>
             </w:r>
             <w:r>
               <w:rPr>
@@ -16396,7 +16396,7 @@
                 <w:sz w:val="17"/>
                 <w:szCs w:val="17"/>
               </w:rPr>
-              <w:t xml:space="preserve">1.x </w:t>
+              <w:t xml:space="preserve">1.0 </w:t>
             </w:r>
             <w:r>
               <w:rPr>
@@ -17238,7 +17238,7 @@
                 <w:sz w:val="17"/>
                 <w:szCs w:val="17"/>
               </w:rPr>
-              <w:t xml:space="preserve">: 1.x </w:t>
+              <w:t xml:space="preserve">: 1.0 </w:t>
             </w:r>
             <w:r>
               <w:rPr>
@@ -17778,7 +17778,7 @@
         <w:t>유지됨</w:t>
       </w:r>
       <w:r>
-        <w:t xml:space="preserve">. 1.x </w:t>
+        <w:t xml:space="preserve">. 1.0 </w:t>
       </w:r>
       <w:r>
         <w:t>프로젝트를</w:t>
@@ -21213,7 +21213,7 @@
                 <w:sz w:val="17"/>
                 <w:szCs w:val="17"/>
               </w:rPr>
-              <w:t xml:space="preserve">. 1.x </w:t>
+              <w:t xml:space="preserve">. 1.0 </w:t>
             </w:r>
             <w:r>
               <w:rPr>
@@ -22480,7 +22480,7 @@
                 <w:sz w:val="17"/>
                 <w:szCs w:val="17"/>
               </w:rPr>
-              <w:t xml:space="preserve">, 1.x </w:t>
+              <w:t xml:space="preserve">, 1.0 </w:t>
             </w:r>
             <w:r>
               <w:rPr>
@@ -23454,7 +23454,7 @@
                 <w:sz w:val="17"/>
                 <w:szCs w:val="17"/>
               </w:rPr>
-              <w:t xml:space="preserve"> 1.x</w:t>
+              <w:t xml:space="preserve"> 1.0</w:t>
             </w:r>
             <w:r>
               <w:rPr>
@@ -23595,7 +23595,7 @@
                 <w:sz w:val="17"/>
                 <w:szCs w:val="17"/>
               </w:rPr>
-              <w:t xml:space="preserve">, 1.x </w:t>
+              <w:t xml:space="preserve">, 1.0 </w:t>
             </w:r>
             <w:r>
               <w:rPr>
@@ -24450,7 +24450,7 @@
                 <w:sz w:val="17"/>
                 <w:szCs w:val="17"/>
               </w:rPr>
-              <w:t>(1.x</w:t>
+              <w:t>(1.0</w:t>
             </w:r>
             <w:r>
               <w:rPr>
@@ -27235,7 +27235,7 @@
                 <w:sz w:val="17"/>
                 <w:szCs w:val="17"/>
               </w:rPr>
-              <w:t xml:space="preserve"> 1.x</w:t>
+              <w:t xml:space="preserve"> 1.0</w:t>
             </w:r>
             <w:r>
               <w:rPr>
@@ -28288,7 +28288,7 @@
                 <w:sz w:val="17"/>
                 <w:szCs w:val="17"/>
               </w:rPr>
-              <w:t>1.x</w:t>
+              <w:t>1.0</w:t>
             </w:r>
             <w:r>
               <w:rPr>

</xml_diff>